<commit_message>
test reports and p-v curves
</commit_message>
<xml_diff>
--- a/Analog-Signal-Components/PAX/PAM-2025/PAM-modules/detector-module/detector-module-v2/Jan26_production/module097_report.docx
+++ b/Analog-Signal-Components/PAX/PAM-2025/PAM-modules/detector-module/detector-module-v2/Jan26_production/module097_report.docx
@@ -27,7 +27,16 @@
           <w:sz w:val="32"/>
           <w:szCs w:val="32"/>
         </w:rPr>
-        <w:t>97</w:t>
+        <w:t>9</w:t>
+      </w:r>
+      <w:r>
+        <w:rPr>
+          <w:b/>
+          <w:bCs/>
+          <w:sz w:val="32"/>
+          <w:szCs w:val="32"/>
+        </w:rPr>
+        <w:t>8</w:t>
       </w:r>
       <w:r>
         <w:rPr>
@@ -209,10 +218,10 @@
           <w:noProof/>
         </w:rPr>
         <w:drawing>
-          <wp:inline distT="0" distB="0" distL="0" distR="0" wp14:anchorId="6496002C" wp14:editId="567E556C">
+          <wp:inline distT="0" distB="0" distL="0" distR="0" wp14:anchorId="7CAC884B" wp14:editId="44EEF391">
             <wp:extent cx="5972810" cy="4778375"/>
             <wp:effectExtent l="0" t="0" r="0" b="0"/>
-            <wp:docPr id="548190668" name="Picture 9"/>
+            <wp:docPr id="1376071048" name="Picture 1"/>
             <wp:cNvGraphicFramePr>
               <a:graphicFrameLocks xmlns:a="http://schemas.openxmlformats.org/drawingml/2006/main" noChangeAspect="1"/>
             </wp:cNvGraphicFramePr>
@@ -220,7 +229,7 @@
               <a:graphicData uri="http://schemas.openxmlformats.org/drawingml/2006/picture">
                 <pic:pic xmlns:pic="http://schemas.openxmlformats.org/drawingml/2006/picture">
                   <pic:nvPicPr>
-                    <pic:cNvPr id="548190668" name="Picture 548190668"/>
+                    <pic:cNvPr id="1376071048" name="Picture 1376071048"/>
                     <pic:cNvPicPr/>
                   </pic:nvPicPr>
                   <pic:blipFill>
@@ -567,7 +576,7 @@
           <w:noProof/>
         </w:rPr>
         <w:drawing>
-          <wp:anchor distT="0" distB="0" distL="114300" distR="114300" simplePos="0" relativeHeight="251664384" behindDoc="0" locked="0" layoutInCell="1" allowOverlap="1" wp14:anchorId="6F775B1C" wp14:editId="4CC1B76A">
+          <wp:anchor distT="0" distB="0" distL="114300" distR="114300" simplePos="0" relativeHeight="251664384" behindDoc="0" locked="0" layoutInCell="1" allowOverlap="1" wp14:anchorId="6F775B1C" wp14:editId="6DEB914A">
             <wp:simplePos x="0" y="0"/>
             <wp:positionH relativeFrom="column">
               <wp:posOffset>4008491</wp:posOffset>
@@ -1054,7 +1063,7 @@
           <w:szCs w:val="28"/>
         </w:rPr>
         <w:drawing>
-          <wp:anchor distT="0" distB="0" distL="114300" distR="114300" simplePos="0" relativeHeight="251666432" behindDoc="1" locked="0" layoutInCell="1" allowOverlap="1" wp14:anchorId="7B5D8638" wp14:editId="6661B09F">
+          <wp:anchor distT="0" distB="0" distL="114300" distR="114300" simplePos="0" relativeHeight="251666432" behindDoc="1" locked="0" layoutInCell="1" allowOverlap="1" wp14:anchorId="7B5D8638" wp14:editId="1E02D67F">
             <wp:simplePos x="0" y="0"/>
             <wp:positionH relativeFrom="column">
               <wp:posOffset>4004310</wp:posOffset>

</xml_diff>